<commit_message>
fix: docx conforme au schéma (ordre pPr, tblLayout unique, zoom), logo illisible toléré
Co-Authored-By: Claude Sonnet 5.5 <noreply@anthropic.com>
</commit_message>
<xml_diff>
--- a/rapport_incident.docx
+++ b/rapport_incident.docx
@@ -58,16 +58,16 @@
     </w:p>
     <w:p>
       <w:pPr>
+        <w:keepNext/>
         <w:pBdr>
           <w:top w:val="single" w:sz="4" w:space="3" w:color="1FA3A8"/>
           <w:left w:val="single" w:sz="4" w:space="3" w:color="1FA3A8"/>
           <w:bottom w:val="single" w:sz="4" w:space="3" w:color="1FA3A8"/>
           <w:right w:val="single" w:sz="4" w:space="3" w:color="1FA3A8"/>
         </w:pBdr>
+        <w:shd w:val="clear" w:color="auto" w:fill="1FA3A8"/>
         <w:spacing w:before="0" w:after="720"/>
         <w:jc w:val="center"/>
-        <w:keepNext/>
-        <w:shd w:val="clear" w:color="auto" w:fill="1FA3A8"/>
       </w:pPr>
       <w:r>
         <w:rPr>
@@ -120,9 +120,9 @@
     </w:p>
     <w:p>
       <w:pPr>
+        <w:shd w:val="clear" w:color="auto" w:fill="C0392B"/>
         <w:spacing w:before="0" w:after="0"/>
         <w:jc w:val="center"/>
-        <w:shd w:val="clear" w:color="auto" w:fill="C0392B"/>
       </w:pPr>
       <w:r>
         <w:rPr>
@@ -154,15 +154,15 @@
     </w:p>
     <w:p>
       <w:pPr>
+        <w:keepNext/>
         <w:pBdr>
           <w:top w:val="single" w:sz="4" w:space="3" w:color="1B2A4A"/>
           <w:left w:val="single" w:sz="4" w:space="3" w:color="1B2A4A"/>
           <w:bottom w:val="single" w:sz="4" w:space="3" w:color="1B2A4A"/>
           <w:right w:val="single" w:sz="4" w:space="3" w:color="1B2A4A"/>
         </w:pBdr>
+        <w:shd w:val="clear" w:color="auto" w:fill="1B2A4A"/>
         <w:spacing w:before="200" w:after="120"/>
-        <w:keepNext/>
-        <w:shd w:val="clear" w:color="auto" w:fill="1B2A4A"/>
       </w:pPr>
       <w:r>
         <w:rPr>
@@ -214,15 +214,15 @@
     </w:p>
     <w:p>
       <w:pPr>
+        <w:keepNext/>
         <w:pBdr>
           <w:top w:val="single" w:sz="4" w:space="3" w:color="1B2A4A"/>
           <w:left w:val="single" w:sz="4" w:space="3" w:color="1B2A4A"/>
           <w:bottom w:val="single" w:sz="4" w:space="3" w:color="1B2A4A"/>
           <w:right w:val="single" w:sz="4" w:space="3" w:color="1B2A4A"/>
         </w:pBdr>
+        <w:shd w:val="clear" w:color="auto" w:fill="1B2A4A"/>
         <w:spacing w:before="200" w:after="120"/>
-        <w:keepNext/>
-        <w:shd w:val="clear" w:color="auto" w:fill="1B2A4A"/>
       </w:pPr>
       <w:r>
         <w:rPr>
@@ -373,15 +373,15 @@
     </w:p>
     <w:p>
       <w:pPr>
+        <w:keepNext/>
         <w:pBdr>
           <w:top w:val="single" w:sz="4" w:space="3" w:color="1B2A4A"/>
           <w:left w:val="single" w:sz="4" w:space="3" w:color="1B2A4A"/>
           <w:bottom w:val="single" w:sz="4" w:space="3" w:color="1B2A4A"/>
           <w:right w:val="single" w:sz="4" w:space="3" w:color="1B2A4A"/>
         </w:pBdr>
+        <w:shd w:val="clear" w:color="auto" w:fill="1B2A4A"/>
         <w:spacing w:before="200" w:after="120"/>
-        <w:keepNext/>
-        <w:shd w:val="clear" w:color="auto" w:fill="1B2A4A"/>
       </w:pPr>
       <w:r>
         <w:rPr>
@@ -519,15 +519,15 @@
     </w:p>
     <w:p>
       <w:pPr>
+        <w:keepNext/>
         <w:pBdr>
           <w:top w:val="single" w:sz="4" w:space="3" w:color="1B2A4A"/>
           <w:left w:val="single" w:sz="4" w:space="3" w:color="1B2A4A"/>
           <w:bottom w:val="single" w:sz="4" w:space="3" w:color="1B2A4A"/>
           <w:right w:val="single" w:sz="4" w:space="3" w:color="1B2A4A"/>
         </w:pBdr>
+        <w:shd w:val="clear" w:color="auto" w:fill="1B2A4A"/>
         <w:spacing w:before="200" w:after="120"/>
-        <w:keepNext/>
-        <w:shd w:val="clear" w:color="auto" w:fill="1B2A4A"/>
       </w:pPr>
       <w:r>
         <w:rPr>
@@ -622,15 +622,15 @@
     </w:p>
     <w:p>
       <w:pPr>
+        <w:keepNext/>
         <w:pBdr>
           <w:top w:val="single" w:sz="4" w:space="3" w:color="1B2A4A"/>
           <w:left w:val="single" w:sz="4" w:space="3" w:color="1B2A4A"/>
           <w:bottom w:val="single" w:sz="4" w:space="3" w:color="1B2A4A"/>
           <w:right w:val="single" w:sz="4" w:space="3" w:color="1B2A4A"/>
         </w:pBdr>
+        <w:shd w:val="clear" w:color="auto" w:fill="1B2A4A"/>
         <w:spacing w:before="200" w:after="120"/>
-        <w:keepNext/>
-        <w:shd w:val="clear" w:color="auto" w:fill="1B2A4A"/>
       </w:pPr>
       <w:r>
         <w:rPr>
@@ -695,12 +695,12 @@
     </w:p>
     <w:p>
       <w:pPr>
+        <w:shd w:val="clear" w:color="auto" w:fill="FBEAE8"/>
         <w:tabs>
           <w:tab w:pos="680" w:val="left"/>
         </w:tabs>
         <w:spacing w:before="0" w:after="40"/>
         <w:ind w:left="680" w:hanging="397"/>
-        <w:shd w:val="clear" w:color="auto" w:fill="FBEAE8"/>
       </w:pPr>
       <w:r>
         <w:rPr>
@@ -720,12 +720,12 @@
     </w:p>
     <w:p>
       <w:pPr>
+        <w:shd w:val="clear" w:color="auto" w:fill="FBEAE8"/>
         <w:tabs>
           <w:tab w:pos="680" w:val="left"/>
         </w:tabs>
         <w:spacing w:before="0" w:after="40"/>
         <w:ind w:left="680" w:hanging="397"/>
-        <w:shd w:val="clear" w:color="auto" w:fill="FBEAE8"/>
       </w:pPr>
       <w:r>
         <w:rPr>
@@ -745,12 +745,12 @@
     </w:p>
     <w:p>
       <w:pPr>
+        <w:shd w:val="clear" w:color="auto" w:fill="FBEAE8"/>
         <w:tabs>
           <w:tab w:pos="680" w:val="left"/>
         </w:tabs>
         <w:spacing w:before="0" w:after="40"/>
         <w:ind w:left="680" w:hanging="397"/>
-        <w:shd w:val="clear" w:color="auto" w:fill="FBEAE8"/>
       </w:pPr>
       <w:r>
         <w:rPr>
@@ -770,12 +770,12 @@
     </w:p>
     <w:p>
       <w:pPr>
+        <w:shd w:val="clear" w:color="auto" w:fill="FBEAE8"/>
         <w:tabs>
           <w:tab w:pos="680" w:val="left"/>
         </w:tabs>
         <w:spacing w:before="0" w:after="40"/>
         <w:ind w:left="680" w:hanging="397"/>
-        <w:shd w:val="clear" w:color="auto" w:fill="FBEAE8"/>
       </w:pPr>
       <w:r>
         <w:rPr>
@@ -795,12 +795,12 @@
     </w:p>
     <w:p>
       <w:pPr>
+        <w:shd w:val="clear" w:color="auto" w:fill="FBEAE8"/>
         <w:tabs>
           <w:tab w:pos="680" w:val="left"/>
         </w:tabs>
         <w:spacing w:before="0" w:after="40"/>
         <w:ind w:left="680" w:hanging="397"/>
-        <w:shd w:val="clear" w:color="auto" w:fill="FBEAE8"/>
       </w:pPr>
       <w:r>
         <w:rPr>
@@ -820,12 +820,12 @@
     </w:p>
     <w:p>
       <w:pPr>
+        <w:shd w:val="clear" w:color="auto" w:fill="FBEAE8"/>
         <w:tabs>
           <w:tab w:pos="680" w:val="left"/>
         </w:tabs>
         <w:spacing w:before="0" w:after="40"/>
         <w:ind w:left="680" w:hanging="397"/>
-        <w:shd w:val="clear" w:color="auto" w:fill="FBEAE8"/>
       </w:pPr>
       <w:r>
         <w:rPr>
@@ -865,15 +865,15 @@
     </w:p>
     <w:p>
       <w:pPr>
+        <w:keepNext/>
         <w:pBdr>
           <w:top w:val="single" w:sz="4" w:space="3" w:color="1B2A4A"/>
           <w:left w:val="single" w:sz="4" w:space="3" w:color="1B2A4A"/>
           <w:bottom w:val="single" w:sz="4" w:space="3" w:color="1B2A4A"/>
           <w:right w:val="single" w:sz="4" w:space="3" w:color="1B2A4A"/>
         </w:pBdr>
+        <w:shd w:val="clear" w:color="auto" w:fill="1B2A4A"/>
         <w:spacing w:before="200" w:after="120"/>
-        <w:keepNext/>
-        <w:shd w:val="clear" w:color="auto" w:fill="1B2A4A"/>
       </w:pPr>
       <w:r>
         <w:rPr>
@@ -890,7 +890,6 @@
         <w:jc w:val="center"/>
         <w:tblLayout w:type="fixed"/>
         <w:tblLook w:firstColumn="1" w:firstRow="1" w:lastColumn="0" w:lastRow="0" w:noHBand="0" w:noVBand="1" w:val="04A0"/>
-        <w:tblLayout w:type="fixed"/>
       </w:tblPr>
       <w:tblGrid>
         <w:gridCol w:w="1020"/>
@@ -1463,15 +1462,15 @@
     </w:p>
     <w:p>
       <w:pPr>
+        <w:keepNext/>
         <w:pBdr>
           <w:top w:val="single" w:sz="4" w:space="3" w:color="1B2A4A"/>
           <w:left w:val="single" w:sz="4" w:space="3" w:color="1B2A4A"/>
           <w:bottom w:val="single" w:sz="4" w:space="3" w:color="1B2A4A"/>
           <w:right w:val="single" w:sz="4" w:space="3" w:color="1B2A4A"/>
         </w:pBdr>
+        <w:shd w:val="clear" w:color="auto" w:fill="1B2A4A"/>
         <w:spacing w:before="200" w:after="120"/>
-        <w:keepNext/>
-        <w:shd w:val="clear" w:color="auto" w:fill="1B2A4A"/>
       </w:pPr>
       <w:r>
         <w:rPr>
@@ -1557,15 +1556,15 @@
     </w:p>
     <w:p>
       <w:pPr>
+        <w:keepNext/>
         <w:pBdr>
           <w:top w:val="single" w:sz="4" w:space="3" w:color="1B2A4A"/>
           <w:left w:val="single" w:sz="4" w:space="3" w:color="1B2A4A"/>
           <w:bottom w:val="single" w:sz="4" w:space="3" w:color="1B2A4A"/>
           <w:right w:val="single" w:sz="4" w:space="3" w:color="1B2A4A"/>
         </w:pBdr>
+        <w:shd w:val="clear" w:color="auto" w:fill="1B2A4A"/>
         <w:spacing w:before="200" w:after="120"/>
-        <w:keepNext/>
-        <w:shd w:val="clear" w:color="auto" w:fill="1B2A4A"/>
       </w:pPr>
       <w:r>
         <w:rPr>
@@ -1582,7 +1581,6 @@
         <w:jc w:val="center"/>
         <w:tblLayout w:type="fixed"/>
         <w:tblLook w:firstColumn="1" w:firstRow="1" w:lastColumn="0" w:lastRow="0" w:noHBand="0" w:noVBand="1" w:val="04A0"/>
-        <w:tblLayout w:type="fixed"/>
       </w:tblPr>
       <w:tblGrid>
         <w:gridCol w:w="3288"/>
@@ -2254,15 +2252,15 @@
     </w:tbl>
     <w:p>
       <w:pPr>
+        <w:keepNext/>
         <w:pBdr>
           <w:top w:val="single" w:sz="4" w:space="3" w:color="1B2A4A"/>
           <w:left w:val="single" w:sz="4" w:space="3" w:color="1B2A4A"/>
           <w:bottom w:val="single" w:sz="4" w:space="3" w:color="1B2A4A"/>
           <w:right w:val="single" w:sz="4" w:space="3" w:color="1B2A4A"/>
         </w:pBdr>
+        <w:shd w:val="clear" w:color="auto" w:fill="1B2A4A"/>
         <w:spacing w:before="200" w:after="120"/>
-        <w:keepNext/>
-        <w:shd w:val="clear" w:color="auto" w:fill="1B2A4A"/>
       </w:pPr>
       <w:r>
         <w:rPr>
@@ -2360,15 +2358,15 @@
     </w:p>
     <w:p>
       <w:pPr>
+        <w:keepNext/>
         <w:pBdr>
           <w:top w:val="single" w:sz="4" w:space="3" w:color="1B2A4A"/>
           <w:left w:val="single" w:sz="4" w:space="3" w:color="1B2A4A"/>
           <w:bottom w:val="single" w:sz="4" w:space="3" w:color="1B2A4A"/>
           <w:right w:val="single" w:sz="4" w:space="3" w:color="1B2A4A"/>
         </w:pBdr>
+        <w:shd w:val="clear" w:color="auto" w:fill="1B2A4A"/>
         <w:spacing w:before="200" w:after="120"/>
-        <w:keepNext/>
-        <w:shd w:val="clear" w:color="auto" w:fill="1B2A4A"/>
       </w:pPr>
       <w:r>
         <w:rPr>
@@ -2385,7 +2383,6 @@
         <w:jc w:val="center"/>
         <w:tblLayout w:type="fixed"/>
         <w:tblLook w:firstColumn="1" w:firstRow="1" w:lastColumn="0" w:lastRow="0" w:noHBand="0" w:noVBand="1" w:val="04A0"/>
-        <w:tblLayout w:type="fixed"/>
       </w:tblPr>
       <w:tblGrid>
         <w:gridCol w:w="4649"/>
@@ -2811,8 +2808,8 @@
     </w:tbl>
     <w:p>
       <w:pPr>
+        <w:shd w:val="clear" w:color="auto" w:fill="FFF8E6"/>
         <w:spacing w:before="160" w:after="60"/>
-        <w:shd w:val="clear" w:color="auto" w:fill="FFF8E6"/>
       </w:pPr>
       <w:r>
         <w:rPr>
@@ -2851,19 +2848,19 @@
   <w:p>
     <w:pPr>
       <w:pStyle w:val="Footer"/>
+      <w:pBdr>
+        <w:top w:val="single" w:sz="6" w:space="4" w:color="1FA3A8"/>
+      </w:pBdr>
       <w:tabs>
         <w:tab w:pos="9638" w:val="right"/>
       </w:tabs>
-      <w:pBdr>
-        <w:top w:val="single" w:sz="6" w:space="4" w:color="1FA3A8"/>
-      </w:pBdr>
     </w:pPr>
     <w:r>
       <w:rPr>
         <w:color w:val="6B7A86"/>
         <w:sz w:val="15"/>
       </w:rPr>
-      <w:t>Document généré automatiquement le 06/10/2026 à 17:10 UTC – ForCERT</w:t>
+      <w:t>Document généré automatiquement le 06/10/2026 à 17:11 UTC – ForCERT</w:t>
     </w:r>
     <w:r>
       <w:rPr>

</xml_diff>

<commit_message>
feat: rapport Word à la charte Formind (couleurs exactes, police Poppins), suppression du PDF
- couleurs relevées sur la charte : #002236 et #0089A4
- police Poppins, repli Arial déclaré dans la table des polices
- suppression de rapport_pdf.py, de l'option --pdf et du livrable PDF
- rapport_incident.docx régénéré sur le jeu fourni

Co-Authored-By: Claude Opus 5.5 <noreply@anthropic.com>
</commit_message>
<xml_diff>
--- a/rapport_incident.docx
+++ b/rapport_incident.docx
@@ -50,7 +50,7 @@
       <w:r>
         <w:rPr>
           <w:b/>
-          <w:color w:val="1B2A4A"/>
+          <w:color w:val="002236"/>
           <w:sz w:val="56"/>
         </w:rPr>
         <w:t>Rapport d'incident de sécurité</w:t>
@@ -60,12 +60,12 @@
       <w:pPr>
         <w:keepNext/>
         <w:pBdr>
-          <w:top w:val="single" w:sz="4" w:space="3" w:color="1FA3A8"/>
-          <w:left w:val="single" w:sz="4" w:space="3" w:color="1FA3A8"/>
-          <w:bottom w:val="single" w:sz="4" w:space="3" w:color="1FA3A8"/>
-          <w:right w:val="single" w:sz="4" w:space="3" w:color="1FA3A8"/>
+          <w:top w:val="single" w:sz="4" w:space="3" w:color="0089A4"/>
+          <w:left w:val="single" w:sz="4" w:space="3" w:color="0089A4"/>
+          <w:bottom w:val="single" w:sz="4" w:space="3" w:color="0089A4"/>
+          <w:right w:val="single" w:sz="4" w:space="3" w:color="0089A4"/>
         </w:pBdr>
-        <w:shd w:val="clear" w:color="auto" w:fill="1FA3A8"/>
+        <w:shd w:val="clear" w:color="auto" w:fill="0089A4"/>
         <w:spacing w:before="0" w:after="720"/>
         <w:jc w:val="center"/>
       </w:pPr>
@@ -86,10 +86,10 @@
       <w:r>
         <w:rPr>
           <w:b/>
-          <w:color w:val="1B2A4A"/>
+          <w:color w:val="002236"/>
           <w:sz w:val="32"/>
         </w:rPr>
-        <w:t>6 octobre 2026</w:t>
+        <w:t>7 octobre 2026</w:t>
       </w:r>
     </w:p>
     <w:p>
@@ -156,12 +156,12 @@
       <w:pPr>
         <w:keepNext/>
         <w:pBdr>
-          <w:top w:val="single" w:sz="4" w:space="3" w:color="1B2A4A"/>
-          <w:left w:val="single" w:sz="4" w:space="3" w:color="1B2A4A"/>
-          <w:bottom w:val="single" w:sz="4" w:space="3" w:color="1B2A4A"/>
-          <w:right w:val="single" w:sz="4" w:space="3" w:color="1B2A4A"/>
+          <w:top w:val="single" w:sz="4" w:space="3" w:color="002236"/>
+          <w:left w:val="single" w:sz="4" w:space="3" w:color="002236"/>
+          <w:bottom w:val="single" w:sz="4" w:space="3" w:color="002236"/>
+          <w:right w:val="single" w:sz="4" w:space="3" w:color="002236"/>
         </w:pBdr>
-        <w:shd w:val="clear" w:color="auto" w:fill="1B2A4A"/>
+        <w:shd w:val="clear" w:color="auto" w:fill="002236"/>
         <w:spacing w:before="200" w:after="120"/>
       </w:pPr>
       <w:r>
@@ -216,12 +216,12 @@
       <w:pPr>
         <w:keepNext/>
         <w:pBdr>
-          <w:top w:val="single" w:sz="4" w:space="3" w:color="1B2A4A"/>
-          <w:left w:val="single" w:sz="4" w:space="3" w:color="1B2A4A"/>
-          <w:bottom w:val="single" w:sz="4" w:space="3" w:color="1B2A4A"/>
-          <w:right w:val="single" w:sz="4" w:space="3" w:color="1B2A4A"/>
+          <w:top w:val="single" w:sz="4" w:space="3" w:color="002236"/>
+          <w:left w:val="single" w:sz="4" w:space="3" w:color="002236"/>
+          <w:bottom w:val="single" w:sz="4" w:space="3" w:color="002236"/>
+          <w:right w:val="single" w:sz="4" w:space="3" w:color="002236"/>
         </w:pBdr>
-        <w:shd w:val="clear" w:color="auto" w:fill="1B2A4A"/>
+        <w:shd w:val="clear" w:color="auto" w:fill="002236"/>
         <w:spacing w:before="200" w:after="120"/>
       </w:pPr>
       <w:r>
@@ -244,7 +244,7 @@
       <w:r>
         <w:rPr>
           <w:b/>
-          <w:color w:val="1FA3A8"/>
+          <w:color w:val="0089A4"/>
           <w:sz w:val="20"/>
         </w:rPr>
         <w:t>1.</w:t>
@@ -268,7 +268,7 @@
       <w:r>
         <w:rPr>
           <w:b/>
-          <w:color w:val="1FA3A8"/>
+          <w:color w:val="0089A4"/>
           <w:sz w:val="20"/>
         </w:rPr>
         <w:t>2.</w:t>
@@ -292,7 +292,7 @@
       <w:r>
         <w:rPr>
           <w:b/>
-          <w:color w:val="1FA3A8"/>
+          <w:color w:val="0089A4"/>
           <w:sz w:val="20"/>
         </w:rPr>
         <w:t>3.</w:t>
@@ -316,7 +316,7 @@
       <w:r>
         <w:rPr>
           <w:b/>
-          <w:color w:val="1FA3A8"/>
+          <w:color w:val="0089A4"/>
           <w:sz w:val="20"/>
         </w:rPr>
         <w:t>4.</w:t>
@@ -340,7 +340,7 @@
       <w:r>
         <w:rPr>
           <w:b/>
-          <w:color w:val="1FA3A8"/>
+          <w:color w:val="0089A4"/>
           <w:sz w:val="20"/>
         </w:rPr>
         <w:t>5.</w:t>
@@ -375,12 +375,12 @@
       <w:pPr>
         <w:keepNext/>
         <w:pBdr>
-          <w:top w:val="single" w:sz="4" w:space="3" w:color="1B2A4A"/>
-          <w:left w:val="single" w:sz="4" w:space="3" w:color="1B2A4A"/>
-          <w:bottom w:val="single" w:sz="4" w:space="3" w:color="1B2A4A"/>
-          <w:right w:val="single" w:sz="4" w:space="3" w:color="1B2A4A"/>
+          <w:top w:val="single" w:sz="4" w:space="3" w:color="002236"/>
+          <w:left w:val="single" w:sz="4" w:space="3" w:color="002236"/>
+          <w:bottom w:val="single" w:sz="4" w:space="3" w:color="002236"/>
+          <w:right w:val="single" w:sz="4" w:space="3" w:color="002236"/>
         </w:pBdr>
-        <w:shd w:val="clear" w:color="auto" w:fill="1B2A4A"/>
+        <w:shd w:val="clear" w:color="auto" w:fill="002236"/>
         <w:spacing w:before="200" w:after="120"/>
       </w:pPr>
       <w:r>
@@ -399,7 +399,7 @@
       <w:r>
         <w:rPr>
           <w:b/>
-          <w:color w:val="1FA3A8"/>
+          <w:color w:val="0089A4"/>
           <w:sz w:val="19"/>
         </w:rPr>
         <w:t xml:space="preserve">Ce que l'on cherche : </w:t>
@@ -419,7 +419,7 @@
       <w:r>
         <w:rPr>
           <w:b/>
-          <w:color w:val="1FA3A8"/>
+          <w:color w:val="0089A4"/>
           <w:sz w:val="19"/>
         </w:rPr>
         <w:t xml:space="preserve">Ce que l'on trouve : </w:t>
@@ -504,7 +504,7 @@
       <w:r>
         <w:rPr>
           <w:b/>
-          <w:color w:val="1FA3A8"/>
+          <w:color w:val="0089A4"/>
           <w:sz w:val="19"/>
         </w:rPr>
         <w:t xml:space="preserve">Conclusion : </w:t>
@@ -521,12 +521,12 @@
       <w:pPr>
         <w:keepNext/>
         <w:pBdr>
-          <w:top w:val="single" w:sz="4" w:space="3" w:color="1B2A4A"/>
-          <w:left w:val="single" w:sz="4" w:space="3" w:color="1B2A4A"/>
-          <w:bottom w:val="single" w:sz="4" w:space="3" w:color="1B2A4A"/>
-          <w:right w:val="single" w:sz="4" w:space="3" w:color="1B2A4A"/>
+          <w:top w:val="single" w:sz="4" w:space="3" w:color="002236"/>
+          <w:left w:val="single" w:sz="4" w:space="3" w:color="002236"/>
+          <w:bottom w:val="single" w:sz="4" w:space="3" w:color="002236"/>
+          <w:right w:val="single" w:sz="4" w:space="3" w:color="002236"/>
         </w:pBdr>
-        <w:shd w:val="clear" w:color="auto" w:fill="1B2A4A"/>
+        <w:shd w:val="clear" w:color="auto" w:fill="002236"/>
         <w:spacing w:before="200" w:after="120"/>
       </w:pPr>
       <w:r>
@@ -545,7 +545,7 @@
       <w:r>
         <w:rPr>
           <w:b/>
-          <w:color w:val="1FA3A8"/>
+          <w:color w:val="0089A4"/>
           <w:sz w:val="19"/>
         </w:rPr>
         <w:t xml:space="preserve">Ce que l'on cherche : </w:t>
@@ -565,7 +565,7 @@
       <w:r>
         <w:rPr>
           <w:b/>
-          <w:color w:val="1FA3A8"/>
+          <w:color w:val="0089A4"/>
           <w:sz w:val="19"/>
         </w:rPr>
         <w:t xml:space="preserve">Ce que l'on trouve : </w:t>
@@ -607,7 +607,7 @@
       <w:r>
         <w:rPr>
           <w:b/>
-          <w:color w:val="1FA3A8"/>
+          <w:color w:val="0089A4"/>
           <w:sz w:val="19"/>
         </w:rPr>
         <w:t xml:space="preserve">Conclusion : </w:t>
@@ -624,12 +624,12 @@
       <w:pPr>
         <w:keepNext/>
         <w:pBdr>
-          <w:top w:val="single" w:sz="4" w:space="3" w:color="1B2A4A"/>
-          <w:left w:val="single" w:sz="4" w:space="3" w:color="1B2A4A"/>
-          <w:bottom w:val="single" w:sz="4" w:space="3" w:color="1B2A4A"/>
-          <w:right w:val="single" w:sz="4" w:space="3" w:color="1B2A4A"/>
+          <w:top w:val="single" w:sz="4" w:space="3" w:color="002236"/>
+          <w:left w:val="single" w:sz="4" w:space="3" w:color="002236"/>
+          <w:bottom w:val="single" w:sz="4" w:space="3" w:color="002236"/>
+          <w:right w:val="single" w:sz="4" w:space="3" w:color="002236"/>
         </w:pBdr>
-        <w:shd w:val="clear" w:color="auto" w:fill="1B2A4A"/>
+        <w:shd w:val="clear" w:color="auto" w:fill="002236"/>
         <w:spacing w:before="200" w:after="120"/>
       </w:pPr>
       <w:r>
@@ -648,7 +648,7 @@
       <w:r>
         <w:rPr>
           <w:b/>
-          <w:color w:val="1FA3A8"/>
+          <w:color w:val="0089A4"/>
           <w:sz w:val="19"/>
         </w:rPr>
         <w:t xml:space="preserve">Ce que l'on cherche : </w:t>
@@ -680,7 +680,7 @@
       <w:r>
         <w:rPr>
           <w:b/>
-          <w:color w:val="1FA3A8"/>
+          <w:color w:val="0089A4"/>
           <w:sz w:val="19"/>
         </w:rPr>
         <w:t xml:space="preserve">Ce que l'on trouve : </w:t>
@@ -850,7 +850,7 @@
       <w:r>
         <w:rPr>
           <w:b/>
-          <w:color w:val="1FA3A8"/>
+          <w:color w:val="0089A4"/>
           <w:sz w:val="19"/>
         </w:rPr>
         <w:t xml:space="preserve">Conclusion : </w:t>
@@ -867,12 +867,12 @@
       <w:pPr>
         <w:keepNext/>
         <w:pBdr>
-          <w:top w:val="single" w:sz="4" w:space="3" w:color="1B2A4A"/>
-          <w:left w:val="single" w:sz="4" w:space="3" w:color="1B2A4A"/>
-          <w:bottom w:val="single" w:sz="4" w:space="3" w:color="1B2A4A"/>
-          <w:right w:val="single" w:sz="4" w:space="3" w:color="1B2A4A"/>
+          <w:top w:val="single" w:sz="4" w:space="3" w:color="002236"/>
+          <w:left w:val="single" w:sz="4" w:space="3" w:color="002236"/>
+          <w:bottom w:val="single" w:sz="4" w:space="3" w:color="002236"/>
+          <w:right w:val="single" w:sz="4" w:space="3" w:color="002236"/>
         </w:pBdr>
-        <w:shd w:val="clear" w:color="auto" w:fill="1B2A4A"/>
+        <w:shd w:val="clear" w:color="auto" w:fill="002236"/>
         <w:spacing w:before="200" w:after="120"/>
       </w:pPr>
       <w:r>
@@ -904,7 +904,7 @@
         <w:tc>
           <w:tcPr>
             <w:tcW w:type="dxa" w:w="1020"/>
-            <w:shd w:val="clear" w:color="auto" w:fill="1B2A4A"/>
+            <w:shd w:val="clear" w:color="auto" w:fill="002236"/>
           </w:tcPr>
           <w:p>
             <w:pPr>
@@ -923,7 +923,7 @@
         <w:tc>
           <w:tcPr>
             <w:tcW w:type="dxa" w:w="1701"/>
-            <w:shd w:val="clear" w:color="auto" w:fill="1B2A4A"/>
+            <w:shd w:val="clear" w:color="auto" w:fill="002236"/>
           </w:tcPr>
           <w:p>
             <w:pPr>
@@ -942,7 +942,7 @@
         <w:tc>
           <w:tcPr>
             <w:tcW w:type="dxa" w:w="1587"/>
-            <w:shd w:val="clear" w:color="auto" w:fill="1B2A4A"/>
+            <w:shd w:val="clear" w:color="auto" w:fill="002236"/>
           </w:tcPr>
           <w:p>
             <w:pPr>
@@ -961,7 +961,7 @@
         <w:tc>
           <w:tcPr>
             <w:tcW w:type="dxa" w:w="5329"/>
-            <w:shd w:val="clear" w:color="auto" w:fill="1B2A4A"/>
+            <w:shd w:val="clear" w:color="auto" w:fill="002236"/>
           </w:tcPr>
           <w:p>
             <w:pPr>
@@ -1464,12 +1464,12 @@
       <w:pPr>
         <w:keepNext/>
         <w:pBdr>
-          <w:top w:val="single" w:sz="4" w:space="3" w:color="1B2A4A"/>
-          <w:left w:val="single" w:sz="4" w:space="3" w:color="1B2A4A"/>
-          <w:bottom w:val="single" w:sz="4" w:space="3" w:color="1B2A4A"/>
-          <w:right w:val="single" w:sz="4" w:space="3" w:color="1B2A4A"/>
+          <w:top w:val="single" w:sz="4" w:space="3" w:color="002236"/>
+          <w:left w:val="single" w:sz="4" w:space="3" w:color="002236"/>
+          <w:bottom w:val="single" w:sz="4" w:space="3" w:color="002236"/>
+          <w:right w:val="single" w:sz="4" w:space="3" w:color="002236"/>
         </w:pBdr>
-        <w:shd w:val="clear" w:color="auto" w:fill="1B2A4A"/>
+        <w:shd w:val="clear" w:color="auto" w:fill="002236"/>
         <w:spacing w:before="200" w:after="120"/>
       </w:pPr>
       <w:r>
@@ -1488,7 +1488,7 @@
       <w:r>
         <w:rPr>
           <w:b/>
-          <w:color w:val="1FA3A8"/>
+          <w:color w:val="0089A4"/>
           <w:sz w:val="19"/>
         </w:rPr>
         <w:t xml:space="preserve">Ce que l'on cherche : </w:t>
@@ -1508,7 +1508,7 @@
       <w:r>
         <w:rPr>
           <w:b/>
-          <w:color w:val="1FA3A8"/>
+          <w:color w:val="0089A4"/>
           <w:sz w:val="19"/>
         </w:rPr>
         <w:t xml:space="preserve">Ce que l'on trouve : </w:t>
@@ -1528,7 +1528,7 @@
       <w:r>
         <w:rPr>
           <w:b/>
-          <w:color w:val="1FA3A8"/>
+          <w:color w:val="0089A4"/>
           <w:sz w:val="19"/>
         </w:rPr>
         <w:t xml:space="preserve">Conclusion : </w:t>
@@ -1558,12 +1558,12 @@
       <w:pPr>
         <w:keepNext/>
         <w:pBdr>
-          <w:top w:val="single" w:sz="4" w:space="3" w:color="1B2A4A"/>
-          <w:left w:val="single" w:sz="4" w:space="3" w:color="1B2A4A"/>
-          <w:bottom w:val="single" w:sz="4" w:space="3" w:color="1B2A4A"/>
-          <w:right w:val="single" w:sz="4" w:space="3" w:color="1B2A4A"/>
+          <w:top w:val="single" w:sz="4" w:space="3" w:color="002236"/>
+          <w:left w:val="single" w:sz="4" w:space="3" w:color="002236"/>
+          <w:bottom w:val="single" w:sz="4" w:space="3" w:color="002236"/>
+          <w:right w:val="single" w:sz="4" w:space="3" w:color="002236"/>
         </w:pBdr>
-        <w:shd w:val="clear" w:color="auto" w:fill="1B2A4A"/>
+        <w:shd w:val="clear" w:color="auto" w:fill="002236"/>
         <w:spacing w:before="200" w:after="120"/>
       </w:pPr>
       <w:r>
@@ -1594,7 +1594,7 @@
         <w:tc>
           <w:tcPr>
             <w:tcW w:type="dxa" w:w="3288"/>
-            <w:shd w:val="clear" w:color="auto" w:fill="1B2A4A"/>
+            <w:shd w:val="clear" w:color="auto" w:fill="002236"/>
           </w:tcPr>
           <w:p>
             <w:pPr>
@@ -1613,7 +1613,7 @@
         <w:tc>
           <w:tcPr>
             <w:tcW w:type="dxa" w:w="4876"/>
-            <w:shd w:val="clear" w:color="auto" w:fill="1B2A4A"/>
+            <w:shd w:val="clear" w:color="auto" w:fill="002236"/>
           </w:tcPr>
           <w:p>
             <w:pPr>
@@ -1632,7 +1632,7 @@
         <w:tc>
           <w:tcPr>
             <w:tcW w:type="dxa" w:w="1474"/>
-            <w:shd w:val="clear" w:color="auto" w:fill="1B2A4A"/>
+            <w:shd w:val="clear" w:color="auto" w:fill="002236"/>
           </w:tcPr>
           <w:p>
             <w:pPr>
@@ -2181,7 +2181,7 @@
             <w:r>
               <w:rPr>
                 <w:b/>
-                <w:color w:val="1FA3A8"/>
+                <w:color w:val="0089A4"/>
                 <w:sz w:val="16"/>
               </w:rPr>
               <w:t>SUIVI</w:t>
@@ -2241,7 +2241,7 @@
             <w:r>
               <w:rPr>
                 <w:b/>
-                <w:color w:val="1FA3A8"/>
+                <w:color w:val="0089A4"/>
                 <w:sz w:val="16"/>
               </w:rPr>
               <w:t>SUIVI</w:t>
@@ -2254,12 +2254,12 @@
       <w:pPr>
         <w:keepNext/>
         <w:pBdr>
-          <w:top w:val="single" w:sz="4" w:space="3" w:color="1B2A4A"/>
-          <w:left w:val="single" w:sz="4" w:space="3" w:color="1B2A4A"/>
-          <w:bottom w:val="single" w:sz="4" w:space="3" w:color="1B2A4A"/>
-          <w:right w:val="single" w:sz="4" w:space="3" w:color="1B2A4A"/>
+          <w:top w:val="single" w:sz="4" w:space="3" w:color="002236"/>
+          <w:left w:val="single" w:sz="4" w:space="3" w:color="002236"/>
+          <w:bottom w:val="single" w:sz="4" w:space="3" w:color="002236"/>
+          <w:right w:val="single" w:sz="4" w:space="3" w:color="002236"/>
         </w:pBdr>
-        <w:shd w:val="clear" w:color="auto" w:fill="1B2A4A"/>
+        <w:shd w:val="clear" w:color="auto" w:fill="002236"/>
         <w:spacing w:before="200" w:after="120"/>
       </w:pPr>
       <w:r>
@@ -2278,7 +2278,7 @@
       <w:r>
         <w:rPr>
           <w:b/>
-          <w:color w:val="1FA3A8"/>
+          <w:color w:val="0089A4"/>
           <w:sz w:val="19"/>
         </w:rPr>
         <w:t xml:space="preserve">Ce que l'on cherche : </w:t>
@@ -2298,7 +2298,7 @@
       <w:r>
         <w:rPr>
           <w:b/>
-          <w:color w:val="1FA3A8"/>
+          <w:color w:val="0089A4"/>
           <w:sz w:val="19"/>
         </w:rPr>
         <w:t xml:space="preserve">Ce que l'on trouve : </w:t>
@@ -2330,7 +2330,7 @@
       <w:r>
         <w:rPr>
           <w:b/>
-          <w:color w:val="1FA3A8"/>
+          <w:color w:val="0089A4"/>
           <w:sz w:val="19"/>
         </w:rPr>
         <w:t xml:space="preserve">Conclusion : </w:t>
@@ -2360,12 +2360,12 @@
       <w:pPr>
         <w:keepNext/>
         <w:pBdr>
-          <w:top w:val="single" w:sz="4" w:space="3" w:color="1B2A4A"/>
-          <w:left w:val="single" w:sz="4" w:space="3" w:color="1B2A4A"/>
-          <w:bottom w:val="single" w:sz="4" w:space="3" w:color="1B2A4A"/>
-          <w:right w:val="single" w:sz="4" w:space="3" w:color="1B2A4A"/>
+          <w:top w:val="single" w:sz="4" w:space="3" w:color="002236"/>
+          <w:left w:val="single" w:sz="4" w:space="3" w:color="002236"/>
+          <w:bottom w:val="single" w:sz="4" w:space="3" w:color="002236"/>
+          <w:right w:val="single" w:sz="4" w:space="3" w:color="002236"/>
         </w:pBdr>
-        <w:shd w:val="clear" w:color="auto" w:fill="1B2A4A"/>
+        <w:shd w:val="clear" w:color="auto" w:fill="002236"/>
         <w:spacing w:before="200" w:after="120"/>
       </w:pPr>
       <w:r>
@@ -2396,7 +2396,7 @@
         <w:tc>
           <w:tcPr>
             <w:tcW w:type="dxa" w:w="4649"/>
-            <w:shd w:val="clear" w:color="auto" w:fill="1B2A4A"/>
+            <w:shd w:val="clear" w:color="auto" w:fill="002236"/>
           </w:tcPr>
           <w:p>
             <w:pPr>
@@ -2415,7 +2415,7 @@
         <w:tc>
           <w:tcPr>
             <w:tcW w:type="dxa" w:w="1814"/>
-            <w:shd w:val="clear" w:color="auto" w:fill="1B2A4A"/>
+            <w:shd w:val="clear" w:color="auto" w:fill="002236"/>
           </w:tcPr>
           <w:p>
             <w:pPr>
@@ -2434,7 +2434,7 @@
         <w:tc>
           <w:tcPr>
             <w:tcW w:type="dxa" w:w="3175"/>
-            <w:shd w:val="clear" w:color="auto" w:fill="1B2A4A"/>
+            <w:shd w:val="clear" w:color="auto" w:fill="002236"/>
           </w:tcPr>
           <w:p>
             <w:pPr>
@@ -2849,7 +2849,7 @@
     <w:pPr>
       <w:pStyle w:val="Footer"/>
       <w:pBdr>
-        <w:top w:val="single" w:sz="6" w:space="4" w:color="1FA3A8"/>
+        <w:top w:val="single" w:sz="6" w:space="4" w:color="0089A4"/>
       </w:pBdr>
       <w:tabs>
         <w:tab w:pos="9638" w:val="right"/>
@@ -2860,7 +2860,7 @@
         <w:color w:val="6B7A86"/>
         <w:sz w:val="15"/>
       </w:rPr>
-      <w:t>Document généré automatiquement le 06/10/2026 à 17:11 UTC – ForCERT</w:t>
+      <w:t>Document généré automatiquement le 07/10/2026 à 08:31 UTC – ForCERT</w:t>
     </w:r>
     <w:r>
       <w:rPr>
@@ -3315,7 +3315,7 @@
     <w:qFormat/>
     <w:rsid w:val="00FC693F"/>
     <w:rPr>
-      <w:rFonts w:ascii="Arial" w:hAnsi="Arial" w:eastAsia="Arial" w:cs="Arial"/>
+      <w:rFonts w:ascii="Poppins" w:hAnsi="Poppins" w:eastAsia="Poppins" w:cs="Poppins"/>
       <w:sz w:val="19"/>
     </w:rPr>
   </w:style>

</xml_diff>